<commit_message>
fix(docgen): fix image path, exit code and determinism; add advanced conditionals example
- Resolve the repository root independently of the working directory and write
  images to docs/images/examples (was the non-existent docfx_project/...)
- Count failures and exit non-zero instead of always reporting success
- Add .env.example; fixed sample date instead of DateTime.Now
- Add advanced-conditionals example (elseif, in, contains, startswith, exists,
  is empty, grouping) and regenerate examples
- Process into memory so failed runs leave no broken output
- Document the manual WarningReportTemplate.docx copy step; README .NET 10
- Smoke tests over all IExampleGenerators in TriasDev.Templify.Tools.Tests

Part of #152
</commit_message>
<xml_diff>
--- a/examples/outputs/hello-world-output.docx
+++ b/examples/outputs/hello-world-output.docx
@@ -19,7 +19,7 @@
     <w:p/>
     <w:p>
       <w:r>
-        <w:t xml:space="preserve">Welcome to Templify. Today is 2025-11-20 and you are customer #12345.</w:t>
+        <w:t xml:space="preserve">Welcome to Templify. Today is 2025-01-15 and you are customer #12345.</w:t>
       </w:r>
     </w:p>
     <w:p/>
@@ -30,7 +30,7 @@
     </w:p>
     <w:p>
       <w:r>
-        <w:t xml:space="preserve">Balance: 1250,50 EUR</w:t>
+        <w:t xml:space="preserve">Balance: 1250.50 EUR</w:t>
       </w:r>
     </w:p>
     <w:p/>

</xml_diff>